<commit_message>
Mise en forme datasheet
</commit_message>
<xml_diff>
--- a/5. Datasheet/Datasheet_Capteur_Graphite.docx
+++ b/5. Datasheet/Datasheet_Capteur_Graphite.docx
@@ -1533,14 +1533,12 @@
                 <w:rFonts w:ascii="Calibri" w:hAnsi="Calibri" w:cs="Calibri"/>
               </w:rPr>
             </w:pPr>
-            <w:proofErr w:type="gramStart"/>
             <w:r>
               <w:rPr>
                 <w:rFonts w:ascii="Calibri" w:hAnsi="Calibri" w:cs="Calibri"/>
               </w:rPr>
               <w:t>mm</w:t>
             </w:r>
-            <w:proofErr w:type="gramEnd"/>
           </w:p>
         </w:tc>
         <w:tc>
@@ -1637,17 +1635,6 @@
         </w:tc>
       </w:tr>
     </w:tbl>
-    <w:p>
-      <w:pPr>
-        <w:rPr>
-          <w:rFonts w:ascii="Calibri" w:hAnsi="Calibri" w:cs="Calibri"/>
-          <w:b/>
-          <w:bCs/>
-          <w:sz w:val="28"/>
-          <w:szCs w:val="28"/>
-        </w:rPr>
-      </w:pPr>
-    </w:p>
     <w:p>
       <w:pPr>
         <w:rPr>
@@ -2149,7 +2136,6 @@
               <w:rPr>
                 <w:rFonts w:ascii="Calibri" w:hAnsi="Calibri" w:cs="Calibri"/>
               </w:rPr>
-              <w:lastRenderedPageBreak/>
               <w:t>4B</w:t>
             </w:r>
           </w:p>
@@ -2218,6 +2204,17 @@
       <w:pPr>
         <w:rPr>
           <w:rFonts w:ascii="Calibri" w:hAnsi="Calibri" w:cs="Calibri"/>
+        </w:rPr>
+      </w:pPr>
+    </w:p>
+    <w:p>
+      <w:pPr>
+        <w:rPr>
+          <w:rFonts w:ascii="Calibri" w:hAnsi="Calibri" w:cs="Calibri"/>
+          <w:b/>
+          <w:bCs/>
+          <w:sz w:val="28"/>
+          <w:szCs w:val="28"/>
         </w:rPr>
       </w:pPr>
     </w:p>
@@ -2797,7 +2794,9 @@
           <w:szCs w:val="28"/>
         </w:rPr>
       </w:pPr>
-      <w:r>
+    </w:p>
+    <w:p>
+      <w:pPr>
         <w:rPr>
           <w:rFonts w:ascii="Calibri" w:hAnsi="Calibri" w:cs="Calibri"/>
           <w:b/>
@@ -2805,9 +2804,10 @@
           <w:sz w:val="28"/>
           <w:szCs w:val="28"/>
         </w:rPr>
-        <w:t>A</w:t>
-      </w:r>
-      <w:r>
+      </w:pPr>
+    </w:p>
+    <w:p>
+      <w:pPr>
         <w:rPr>
           <w:rFonts w:ascii="Calibri" w:hAnsi="Calibri" w:cs="Calibri"/>
           <w:b/>
@@ -2815,9 +2815,10 @@
           <w:sz w:val="28"/>
           <w:szCs w:val="28"/>
         </w:rPr>
-        <w:t>pplication typique</w:t>
-      </w:r>
-      <w:r>
+      </w:pPr>
+    </w:p>
+    <w:p>
+      <w:pPr>
         <w:rPr>
           <w:rFonts w:ascii="Calibri" w:hAnsi="Calibri" w:cs="Calibri"/>
           <w:b/>
@@ -2825,6 +2826,35 @@
           <w:sz w:val="28"/>
           <w:szCs w:val="28"/>
         </w:rPr>
+      </w:pPr>
+      <w:r>
+        <w:rPr>
+          <w:rFonts w:ascii="Calibri" w:hAnsi="Calibri" w:cs="Calibri"/>
+          <w:b/>
+          <w:bCs/>
+          <w:sz w:val="28"/>
+          <w:szCs w:val="28"/>
+        </w:rPr>
+        <w:t>A</w:t>
+      </w:r>
+      <w:r>
+        <w:rPr>
+          <w:rFonts w:ascii="Calibri" w:hAnsi="Calibri" w:cs="Calibri"/>
+          <w:b/>
+          <w:bCs/>
+          <w:sz w:val="28"/>
+          <w:szCs w:val="28"/>
+        </w:rPr>
+        <w:t>pplication typique</w:t>
+      </w:r>
+      <w:r>
+        <w:rPr>
+          <w:rFonts w:ascii="Calibri" w:hAnsi="Calibri" w:cs="Calibri"/>
+          <w:b/>
+          <w:bCs/>
+          <w:sz w:val="28"/>
+          <w:szCs w:val="28"/>
+        </w:rPr>
         <w:t xml:space="preserve"> de notre capteur</w:t>
       </w:r>
     </w:p>
@@ -2838,7 +2868,6 @@
         <w:rPr>
           <w:noProof/>
         </w:rPr>
-        <w:lastRenderedPageBreak/>
         <w:drawing>
           <wp:inline distT="0" distB="0" distL="0" distR="0" wp14:anchorId="76DBD169" wp14:editId="55A4AE16">
             <wp:extent cx="5760720" cy="2245360"/>
@@ -3123,13 +3152,6 @@
           <w:rFonts w:ascii="Calibri" w:hAnsi="Calibri" w:cs="Calibri"/>
         </w:rPr>
       </w:pPr>
-    </w:p>
-    <w:p>
-      <w:pPr>
-        <w:rPr>
-          <w:rFonts w:ascii="Calibri" w:hAnsi="Calibri" w:cs="Calibri"/>
-        </w:rPr>
-      </w:pPr>
       <w:r>
         <w:rPr>
           <w:rFonts w:ascii="Calibri" w:hAnsi="Calibri" w:cs="Calibri"/>
@@ -3159,14 +3181,7 @@
         <w:rPr>
           <w:rFonts w:ascii="Calibri" w:hAnsi="Calibri" w:cs="Calibri"/>
         </w:rPr>
-        <w:t xml:space="preserve"> par un potentiomètre digital dont la valeur de la résistance est modifiable par </w:t>
-      </w:r>
-      <w:proofErr w:type="gramStart"/>
-      <w:r>
-        <w:rPr>
-          <w:rFonts w:ascii="Calibri" w:hAnsi="Calibri" w:cs="Calibri"/>
-        </w:rPr>
-        <w:t>l’</w:t>
+        <w:t xml:space="preserve"> par un potentiomètre digital dont la valeur de la résistance est modifiable par l’</w:t>
       </w:r>
       <w:proofErr w:type="spellStart"/>
       <w:r>
@@ -3176,7 +3191,6 @@
         <w:t>utilisateur.ice</w:t>
       </w:r>
       <w:proofErr w:type="spellEnd"/>
-      <w:proofErr w:type="gramEnd"/>
       <w:r>
         <w:rPr>
           <w:rFonts w:ascii="Calibri" w:hAnsi="Calibri" w:cs="Calibri"/>

</xml_diff>